<commit_message>
Update documentation report with high-resolution output screenshots for Romit Kakadiya (24CS033)
</commit_message>
<xml_diff>
--- a/AWDF_Practical_1.docx
+++ b/AWDF_Practical_1.docx
@@ -573,15 +573,16 @@
           </w:tcPr>
           <w:p>
             <w:pPr>
-              <w:spacing w:after="32"/>
+              <w:spacing w:after="80"/>
             </w:pPr>
             <w:r>
-              <w:t>Practical 1 execution and implementation output verified for Romit Kakadiya (24CS033).</w:t>
+              <w:t>Practical 1 implementation, execution, and outputs verified for Romit Kakadiya (24CS033).</w:t>
             </w:r>
           </w:p>
           <w:p>
             <w:pPr>
               <w:spacing w:before="160" w:after="160"/>
+              <w:jc w:val="center"/>
             </w:pPr>
             <w:r>
               <w:drawing>

</xml_diff>